<commit_message>
Add $1,000 management fee for next 15-day phase
Reflect expanded scope (viral research + managed paid campaign) in the
client proposal ask table and run-sheet, with scope justification and a
'why $1,000 not $750' objection answer.

Co-Authored-By: Claude Opus 4.8 <noreply@anthropic.com>
Claude-Session: https://claude.ai/code/session_01P2DCQpVLcAmj4xTzqwNxwk
</commit_message>
<xml_diff>
--- a/strategy-reset-v2/Officially_Invested_Strategy_Reset_v2_Client_Proposal.docx
+++ b/strategy-reset-v2/Officially_Invested_Strategy_Reset_v2_Client_Proposal.docx
@@ -3291,6 +3291,36 @@
         <w:t>7 · WHAT WE’RE ASKING FOR TODAY &amp; HOW TO FUND IT</w:t>
       </w:r>
     </w:p>
+    <w:p>
+      <w:pPr>
+        <w:spacing w:before="160" w:after="40"/>
+      </w:pPr>
+      <w:r>
+        <w:rPr>
+          <w:rFonts w:ascii="Calibri" w:hAnsi="Calibri"/>
+          <w:b/>
+          <w:i w:val="0"/>
+          <w:color w:val="1C3559"/>
+          <w:sz w:val="24"/>
+        </w:rPr>
+        <w:t>Your fee for this phase</w:t>
+      </w:r>
+    </w:p>
+    <w:p>
+      <w:pPr>
+        <w:spacing w:after="120"/>
+      </w:pPr>
+      <w:r>
+        <w:rPr>
+          <w:rFonts w:ascii="Calibri" w:hAnsi="Calibri"/>
+          <w:b w:val="0"/>
+          <w:i w:val="0"/>
+          <w:color w:val="11223A"/>
+          <w:sz w:val="22"/>
+        </w:rPr>
+        <w:t>The first 15 days were billed at the original content rate — $750, half of the $1,500/month engagement. This next 15-day phase is $1,000: the scope expands from producing content to running a managed campaign — viral-structure research and hands-on management of the paid boost across all three platforms — which the first block didn't include.</w:t>
+      </w:r>
+    </w:p>
     <w:tbl>
       <w:tblPr>
         <w:tblW w:type="auto" w:w="0"/>
@@ -3448,7 +3478,7 @@
                 <w:color w:val="11223A"/>
                 <w:sz w:val="19"/>
               </w:rPr>
-              <w:t>Milestone 1 — first 15 days (delivered)</w:t>
+              <w:t>Milestone 1 — first 15 days, delivered (close-out)</w:t>
             </w:r>
           </w:p>
         </w:tc>
@@ -3534,7 +3564,7 @@
                 <w:color w:val="11223A"/>
                 <w:sz w:val="19"/>
               </w:rPr>
-              <w:t>Production &amp; ad budget — one cycle (tools + 7-day boost)</w:t>
+              <w:t>Management fee — next 15-day phase (research + managed paid campaign)</w:t>
             </w:r>
           </w:p>
         </w:tc>
@@ -3563,7 +3593,7 @@
                 <w:color w:val="11223A"/>
                 <w:sz w:val="19"/>
               </w:rPr>
-              <w:t>$915</w:t>
+              <w:t>$1,000</w:t>
             </w:r>
           </w:p>
         </w:tc>
@@ -3619,6 +3649,92 @@
                 <w:color w:val="11223A"/>
                 <w:sz w:val="19"/>
               </w:rPr>
+              <w:t>Production &amp; ad budget — one cycle (tools + 7-day boost)</w:t>
+            </w:r>
+          </w:p>
+        </w:tc>
+        <w:tc>
+          <w:tcPr>
+            <w:tcW w:type="dxa" w:w="2016"/>
+            <w:tcMar>
+              <w:top w:w="60" w:type="dxa"/>
+              <w:bottom w:w="60" w:type="dxa"/>
+              <w:start w:w="100" w:type="dxa"/>
+              <w:end w:w="100" w:type="dxa"/>
+            </w:tcMar>
+          </w:tcPr>
+          <w:p>
+            <w:pPr>
+              <w:spacing w:after="0"/>
+              <w:jc w:val="right"/>
+            </w:pPr>
+            <w:r/>
+            <w:r>
+              <w:rPr>
+                <w:rFonts w:ascii="Calibri" w:hAnsi="Calibri"/>
+                <w:b w:val="0"/>
+                <w:i w:val="0"/>
+                <w:color w:val="11223A"/>
+                <w:sz w:val="19"/>
+              </w:rPr>
+              <w:t>$915</w:t>
+            </w:r>
+          </w:p>
+        </w:tc>
+      </w:tr>
+      <w:tr>
+        <w:tc>
+          <w:tcPr>
+            <w:tcW w:type="dxa" w:w="576"/>
+            <w:tcMar>
+              <w:top w:w="60" w:type="dxa"/>
+              <w:bottom w:w="60" w:type="dxa"/>
+              <w:start w:w="100" w:type="dxa"/>
+              <w:end w:w="100" w:type="dxa"/>
+            </w:tcMar>
+            <w:shd w:val="clear" w:color="auto" w:fill="F6F8FB"/>
+          </w:tcPr>
+          <w:p>
+            <w:pPr>
+              <w:spacing w:after="0"/>
+            </w:pPr>
+            <w:r/>
+            <w:r>
+              <w:rPr>
+                <w:rFonts w:ascii="Calibri" w:hAnsi="Calibri"/>
+                <w:b w:val="0"/>
+                <w:i w:val="0"/>
+                <w:color w:val="11223A"/>
+                <w:sz w:val="19"/>
+              </w:rPr>
+              <w:t>4</w:t>
+            </w:r>
+          </w:p>
+        </w:tc>
+        <w:tc>
+          <w:tcPr>
+            <w:tcW w:type="dxa" w:w="7488"/>
+            <w:tcMar>
+              <w:top w:w="60" w:type="dxa"/>
+              <w:bottom w:w="60" w:type="dxa"/>
+              <w:start w:w="100" w:type="dxa"/>
+              <w:end w:w="100" w:type="dxa"/>
+            </w:tcMar>
+            <w:shd w:val="clear" w:color="auto" w:fill="F6F8FB"/>
+          </w:tcPr>
+          <w:p>
+            <w:pPr>
+              <w:spacing w:after="0"/>
+            </w:pPr>
+            <w:r/>
+            <w:r>
+              <w:rPr>
+                <w:rFonts w:ascii="Calibri" w:hAnsi="Calibri"/>
+                <w:b w:val="0"/>
+                <w:i w:val="0"/>
+                <w:color w:val="11223A"/>
+                <w:sz w:val="19"/>
+              </w:rPr>
               <w:t>Performance bonus — paid on free-community signups (on results)</w:t>
             </w:r>
           </w:p>
@@ -3632,6 +3748,7 @@
               <w:start w:w="100" w:type="dxa"/>
               <w:end w:w="100" w:type="dxa"/>
             </w:tcMar>
+            <w:shd w:val="clear" w:color="auto" w:fill="F6F8FB"/>
           </w:tcPr>
           <w:p>
             <w:pPr>
@@ -3670,7 +3787,7 @@
           <w:color w:val="6B7990"/>
           <w:sz w:val="17"/>
         </w:rPr>
-        <w:t>Item 3 is paid only on delivered signups. Items 1 &amp; 2 are what we need to close out and set off.</w:t>
+        <w:t>Item 4 is paid only on delivered signups. Items 1–3 are what we need to close out and set off.</w:t>
       </w:r>
     </w:p>
     <w:p>

</xml_diff>